<commit_message>
fikset det som allerede var fikset. ikke kopiere og lim bilder
</commit_message>
<xml_diff>
--- a/docs/assignment_gretl.docx
+++ b/docs/assignment_gretl.docx
@@ -31,19 +31,7 @@
             <w:pStyle w:val="TOCHeading"/>
           </w:pPr>
           <w:r>
-            <w:t xml:space="preserve">Table</w:t>
-          </w:r>
-          <w:r>
-            <w:t xml:space="preserve"> </w:t>
-          </w:r>
-          <w:r>
-            <w:t xml:space="preserve">of</w:t>
-          </w:r>
-          <w:r>
-            <w:t xml:space="preserve"> </w:t>
-          </w:r>
-          <w:r>
-            <w:t xml:space="preserve">contents</w:t>
+            <w:t xml:space="preserve">Table of contents</w:t>
           </w:r>
         </w:p>
         <w:p>
@@ -157,13 +145,7 @@
         <w:t xml:space="preserve"> </w:t>
       </w:r>
       <w:r>
-        <w:t xml:space="preserve">“</w:t>
-      </w:r>
-      <w:r>
-        <w:t xml:space="preserve">To what extent do socioeconomic factors &amp; health-related behaviors influence mortality rates across states?</w:t>
-      </w:r>
-      <w:r>
-        <w:t xml:space="preserve">”</w:t>
+        <w:t xml:space="preserve">“To what extent do socioeconomic factors &amp; health-related behaviors influence mortality rates across states?”</w:t>
       </w:r>
       <w:r>
         <w:t xml:space="preserve">. </w:t>
@@ -249,7 +231,7 @@
       </w:p>
     </w:p>
     <w:bookmarkEnd w:id="27"/>
-    <w:bookmarkStart w:id="64" w:name="simple-regression-model"/>
+    <w:bookmarkStart w:id="43" w:name="simple-regression-model"/>
     <w:p>
       <w:pPr>
         <w:pStyle w:val="Heading1"/>
@@ -325,145 +307,253 @@
       <w:pPr>
         <w:pStyle w:val="BodyText"/>
       </w:pPr>
+      <m:oMathPara>
+        <m:oMathParaPr>
+          <m:jc m:val="center"/>
+        </m:oMathParaPr>
+        <m:oMath>
+          <m:r>
+            <m:t>M</m:t>
+          </m:r>
+          <m:r>
+            <m:t>O</m:t>
+          </m:r>
+          <m:r>
+            <m:t>R</m:t>
+          </m:r>
+          <m:sSub>
+            <m:e>
+              <m:r>
+                <m:t>T</m:t>
+              </m:r>
+            </m:e>
+            <m:sub>
+              <m:r>
+                <m:t>i</m:t>
+              </m:r>
+            </m:sub>
+          </m:sSub>
+          <m:r>
+            <m:rPr>
+              <m:sty m:val="p"/>
+            </m:rPr>
+            <m:t>=</m:t>
+          </m:r>
+          <m:sSub>
+            <m:e>
+              <m:r>
+                <m:t>β</m:t>
+              </m:r>
+            </m:e>
+            <m:sub>
+              <m:r>
+                <m:t>0</m:t>
+              </m:r>
+            </m:sub>
+          </m:sSub>
+          <m:r>
+            <m:rPr>
+              <m:sty m:val="p"/>
+            </m:rPr>
+            <m:t>+</m:t>
+          </m:r>
+          <m:sSub>
+            <m:e>
+              <m:r>
+                <m:t>β</m:t>
+              </m:r>
+            </m:e>
+            <m:sub>
+              <m:r>
+                <m:t>1</m:t>
+              </m:r>
+            </m:sub>
+          </m:sSub>
+          <m:r>
+            <m:t>I</m:t>
+          </m:r>
+          <m:r>
+            <m:t>N</m:t>
+          </m:r>
+          <m:r>
+            <m:t>C</m:t>
+          </m:r>
+          <m:sSub>
+            <m:e>
+              <m:r>
+                <m:t>C</m:t>
+              </m:r>
+            </m:e>
+            <m:sub>
+              <m:r>
+                <m:t>i</m:t>
+              </m:r>
+            </m:sub>
+          </m:sSub>
+          <m:r>
+            <m:rPr>
+              <m:sty m:val="p"/>
+            </m:rPr>
+            <m:t>+</m:t>
+          </m:r>
+          <m:sSub>
+            <m:e>
+              <m:r>
+                <m:t>u</m:t>
+              </m:r>
+            </m:e>
+            <m:sub>
+              <m:r>
+                <m:t>i</m:t>
+              </m:r>
+            </m:sub>
+          </m:sSub>
+        </m:oMath>
+      </m:oMathPara>
+    </w:p>
+    <w:p>
+      <w:pPr>
+        <w:pStyle w:val="FirstParagraph"/>
+      </w:pPr>
+      <m:oMathPara>
+        <m:oMathParaPr>
+          <m:jc m:val="center"/>
+        </m:oMathParaPr>
+        <m:oMath>
+          <m:acc>
+            <m:accPr>
+              <m:chr m:val="̂"/>
+            </m:accPr>
+            <m:e>
+              <m:r>
+                <m:t>M</m:t>
+              </m:r>
+              <m:r>
+                <m:t>O</m:t>
+              </m:r>
+              <m:r>
+                <m:t>R</m:t>
+              </m:r>
+              <m:r>
+                <m:t>T</m:t>
+              </m:r>
+            </m:e>
+          </m:acc>
+          <m:r>
+            <m:rPr>
+              <m:sty m:val="p"/>
+            </m:rPr>
+            <m:t>=</m:t>
+          </m:r>
+          <m:r>
+            <m:t>908</m:t>
+          </m:r>
+          <m:r>
+            <m:rPr>
+              <m:sty m:val="p"/>
+            </m:rPr>
+            <m:t>,</m:t>
+          </m:r>
+          <m:r>
+            <m:t>592</m:t>
+          </m:r>
+          <m:r>
+            <m:rPr>
+              <m:sty m:val="p"/>
+            </m:rPr>
+            <m:t>−</m:t>
+          </m:r>
+          <m:r>
+            <m:t>0</m:t>
+          </m:r>
+          <m:r>
+            <m:rPr>
+              <m:sty m:val="p"/>
+            </m:rPr>
+            <m:t>,</m:t>
+          </m:r>
+          <m:r>
+            <m:t>00404</m:t>
+          </m:r>
+          <m:r>
+            <m:rPr>
+              <m:sty m:val="p"/>
+            </m:rPr>
+            <m:t>⋅</m:t>
+          </m:r>
+          <m:r>
+            <m:t>I</m:t>
+          </m:r>
+          <m:r>
+            <m:t>N</m:t>
+          </m:r>
+          <m:r>
+            <m:t>C</m:t>
+          </m:r>
+          <m:sSub>
+            <m:e>
+              <m:r>
+                <m:t>C</m:t>
+              </m:r>
+            </m:e>
+            <m:sub>
+              <m:r>
+                <m:t>i</m:t>
+              </m:r>
+            </m:sub>
+          </m:sSub>
+        </m:oMath>
+      </m:oMathPara>
+    </w:p>
+    <w:p>
+      <w:pPr>
+        <w:pStyle w:val="FirstParagraph"/>
+      </w:pPr>
+      <w:r>
+        <w:t xml:space="preserve">The model is estimated to use 51 observations. The estimated intercept is 908,592 and the coefficient for income (INCC) is –0,00404. The R-squared is 0,0040 and the F-statistic is 0,197 with a p-value of 0,659.</w:t>
+      </w:r>
+      <w:r>
+        <w:t xml:space="preserve"> </w:t>
+      </w:r>
+      <w:p>
+        <w:r>
+          <w:br w:type="page"/>
+        </w:r>
+      </w:p>
+    </w:p>
+    <w:p>
+      <w:pPr>
+        <w:pStyle w:val="BodyText"/>
+      </w:pPr>
+      <w:r>
+        <w:rPr>
+          <w:b/>
+          <w:bCs/>
+        </w:rPr>
+        <w:t xml:space="preserve">2B:</w:t>
+      </w:r>
+    </w:p>
+    <w:p>
+      <w:pPr>
+        <w:pStyle w:val="BodyText"/>
+      </w:pPr>
       <w:r>
         <w:drawing>
           <wp:inline>
-            <wp:extent cx="1533525" cy="152400"/>
+            <wp:extent cx="5334000" cy="3240390"/>
             <wp:effectExtent b="0" l="0" r="0" t="0"/>
             <wp:docPr descr="" title="" id="32" name="Picture"/>
             <a:graphic>
               <a:graphicData uri="http://schemas.openxmlformats.org/drawingml/2006/picture">
                 <pic:pic>
                   <pic:nvPicPr>
-                    <pic:cNvPr descr="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" id="33" name="Picture"/>
+                    <pic:cNvPr descr="images/Bilde4.png" id="33" name="Picture"/>
                     <pic:cNvPicPr>
                       <a:picLocks noChangeArrowheads="1" noChangeAspect="1"/>
                     </pic:cNvPicPr>
                   </pic:nvPicPr>
                   <pic:blipFill>
                     <a:blip r:embed="rId31"/>
-                    <a:stretch>
-                      <a:fillRect/>
-                    </a:stretch>
-                  </pic:blipFill>
-                  <pic:spPr bwMode="auto">
-                    <a:xfrm>
-                      <a:off x="0" y="0"/>
-                      <a:ext cx="1533525" cy="152400"/>
-                    </a:xfrm>
-                    <a:prstGeom prst="rect">
-                      <a:avLst/>
-                    </a:prstGeom>
-                    <a:noFill/>
-                    <a:ln w="9525">
-                      <a:noFill/>
-                      <a:headEnd/>
-                      <a:tailEnd/>
-                    </a:ln>
-                  </pic:spPr>
-                </pic:pic>
-              </a:graphicData>
-            </a:graphic>
-          </wp:inline>
-        </w:drawing>
-      </w:r>
-    </w:p>
-    <w:p>
-      <w:pPr>
-        <w:pStyle w:val="BodyText"/>
-      </w:pPr>
-      <w:r>
-        <w:drawing>
-          <wp:inline>
-            <wp:extent cx="1695450" cy="141878"/>
-            <wp:effectExtent b="0" l="0" r="0" t="0"/>
-            <wp:docPr descr="" title="" id="35" name="Picture"/>
-            <a:graphic>
-              <a:graphicData uri="http://schemas.openxmlformats.org/drawingml/2006/picture">
-                <pic:pic>
-                  <pic:nvPicPr>
-                    <pic:cNvPr descr="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" id="36" name="Picture"/>
-                    <pic:cNvPicPr>
-                      <a:picLocks noChangeArrowheads="1" noChangeAspect="1"/>
-                    </pic:cNvPicPr>
-                  </pic:nvPicPr>
-                  <pic:blipFill>
-                    <a:blip r:embed="rId34"/>
-                    <a:stretch>
-                      <a:fillRect/>
-                    </a:stretch>
-                  </pic:blipFill>
-                  <pic:spPr bwMode="auto">
-                    <a:xfrm>
-                      <a:off x="0" y="0"/>
-                      <a:ext cx="1695450" cy="141878"/>
-                    </a:xfrm>
-                    <a:prstGeom prst="rect">
-                      <a:avLst/>
-                    </a:prstGeom>
-                    <a:noFill/>
-                    <a:ln w="9525">
-                      <a:noFill/>
-                      <a:headEnd/>
-                      <a:tailEnd/>
-                    </a:ln>
-                  </pic:spPr>
-                </pic:pic>
-              </a:graphicData>
-            </a:graphic>
-          </wp:inline>
-        </w:drawing>
-      </w:r>
-    </w:p>
-    <w:p>
-      <w:pPr>
-        <w:pStyle w:val="BodyText"/>
-      </w:pPr>
-      <w:r>
-        <w:t xml:space="preserve">The model is estimated to use 51 observations. The estimated intercept is 908,592 and the coefficient for income (INCC) is –0,00404. The R-squared is 0,0040 and the F-statistic is 0,197 with a p-value of 0,659.</w:t>
-      </w:r>
-      <w:r>
-        <w:t xml:space="preserve"> </w:t>
-      </w:r>
-      <w:p>
-        <w:r>
-          <w:br w:type="page"/>
-        </w:r>
-      </w:p>
-    </w:p>
-    <w:p>
-      <w:pPr>
-        <w:pStyle w:val="BodyText"/>
-      </w:pPr>
-      <w:r>
-        <w:rPr>
-          <w:b/>
-          <w:bCs/>
-        </w:rPr>
-        <w:t xml:space="preserve">2B:</w:t>
-      </w:r>
-    </w:p>
-    <w:p>
-      <w:pPr>
-        <w:pStyle w:val="BodyText"/>
-      </w:pPr>
-      <w:r>
-        <w:drawing>
-          <wp:inline>
-            <wp:extent cx="5334000" cy="3240390"/>
-            <wp:effectExtent b="0" l="0" r="0" t="0"/>
-            <wp:docPr descr="" title="" id="38" name="Picture"/>
-            <a:graphic>
-              <a:graphicData uri="http://schemas.openxmlformats.org/drawingml/2006/picture">
-                <pic:pic>
-                  <pic:nvPicPr>
-                    <pic:cNvPr descr="images/Bilde4.png" id="39" name="Picture"/>
-                    <pic:cNvPicPr>
-                      <a:picLocks noChangeArrowheads="1" noChangeAspect="1"/>
-                    </pic:cNvPicPr>
-                  </pic:nvPicPr>
-                  <pic:blipFill>
-                    <a:blip r:embed="rId37"/>
                     <a:stretch>
                       <a:fillRect/>
                     </a:stretch>
@@ -521,18 +611,18 @@
           <wp:inline>
             <wp:extent cx="1323975" cy="151539"/>
             <wp:effectExtent b="0" l="0" r="0" t="0"/>
-            <wp:docPr descr="" title="" id="41" name="Picture"/>
+            <wp:docPr descr="" title="" id="35" name="Picture"/>
             <a:graphic>
               <a:graphicData uri="http://schemas.openxmlformats.org/drawingml/2006/picture">
                 <pic:pic>
                   <pic:nvPicPr>
-                    <pic:cNvPr descr="images/clipboard-3821177194.png" id="42" name="Picture"/>
+                    <pic:cNvPr descr="images/clipboard-3821177194.png" id="36" name="Picture"/>
                     <pic:cNvPicPr>
                       <a:picLocks noChangeArrowheads="1" noChangeAspect="1"/>
                     </pic:cNvPicPr>
                   </pic:nvPicPr>
                   <pic:blipFill>
-                    <a:blip r:embed="rId40"/>
+                    <a:blip r:embed="rId34"/>
                     <a:stretch>
                       <a:fillRect/>
                     </a:stretch>
@@ -596,18 +686,18 @@
           <wp:inline>
             <wp:extent cx="5334000" cy="3669297"/>
             <wp:effectExtent b="0" l="0" r="0" t="0"/>
-            <wp:docPr descr="" title="" id="44" name="Picture"/>
+            <wp:docPr descr="" title="" id="38" name="Picture"/>
             <a:graphic>
               <a:graphicData uri="http://schemas.openxmlformats.org/drawingml/2006/picture">
                 <pic:pic>
                   <pic:nvPicPr>
-                    <pic:cNvPr descr="images/Bilde5.png" id="45" name="Picture"/>
+                    <pic:cNvPr descr="images/Bilde5.png" id="39" name="Picture"/>
                     <pic:cNvPicPr>
                       <a:picLocks noChangeArrowheads="1" noChangeAspect="1"/>
                     </pic:cNvPicPr>
                   </pic:nvPicPr>
                   <pic:blipFill>
-                    <a:blip r:embed="rId43"/>
+                    <a:blip r:embed="rId37"/>
                     <a:stretch>
                       <a:fillRect/>
                     </a:stretch>
@@ -657,307 +747,349 @@
         <w:t xml:space="preserve"> </w:t>
       </w:r>
       <w:r>
-        <w:t xml:space="preserve">From the summary statistics table:  </w:t>
-      </w:r>
+        <w:t xml:space="preserve">From the summary statistics table: $$Mort_i = 908,592-0,00404445*INCC</w:t>
+      </w:r>
+    </w:p>
+    <w:p>
+      <w:pPr>
+        <w:pStyle w:val="BodyText"/>
+      </w:pPr>
+      <w:r>
+        <w:t xml:space="preserve">INCC represents income per capita, measured in U.S. dollars for each state.</w:t>
+      </w:r>
+    </w:p>
+    <w:p>
+      <w:pPr>
+        <w:pStyle w:val="BodyText"/>
+      </w:pPr>
+      <w:r>
+        <w:t xml:space="preserve">In our dataset:</w:t>
+      </w:r>
+    </w:p>
+    <w:p>
+      <w:pPr>
+        <w:pStyle w:val="BodyText"/>
+      </w:pPr>
+      <w:r>
+        <w:t xml:space="preserve">INCC min = 9187</w:t>
+      </w:r>
+    </w:p>
+    <w:p>
+      <w:pPr>
+        <w:pStyle w:val="BodyText"/>
+      </w:pPr>
+      <w:r>
+        <w:t xml:space="preserve">INCC mean = 13249</w:t>
+      </w:r>
+    </w:p>
+    <w:p>
+      <w:pPr>
+        <w:pStyle w:val="BodyText"/>
+      </w:pPr>
+      <w:r>
+        <w:t xml:space="preserve">INCC max = 18187</w:t>
+      </w:r>
+    </w:p>
+    <w:p>
+      <w:pPr>
+        <w:pStyle w:val="BodyText"/>
+      </w:pPr>
+      <w:r>
+        <w:t xml:space="preserve">When INCC = 9187:</w:t>
+      </w:r>
+    </w:p>
+    <w:p>
+      <w:pPr>
+        <w:pStyle w:val="BodyText"/>
+      </w:pPr>
+      <w:r>
+        <w:t xml:space="preserve">Substitute into the equation: When INCC = 9187:</w:t>
+      </w:r>
+    </w:p>
+    <w:p>
+      <w:pPr>
+        <w:pStyle w:val="BodyText"/>
+      </w:pPr>
+      <m:oMathPara>
+        <m:oMathParaPr>
+          <m:jc m:val="center"/>
+        </m:oMathParaPr>
+        <m:oMath>
+          <m:sSub>
+            <m:e>
+              <m:acc>
+                <m:accPr>
+                  <m:chr m:val="̂"/>
+                </m:accPr>
+                <m:e>
+                  <m:r>
+                    <m:t>M</m:t>
+                  </m:r>
+                  <m:r>
+                    <m:t>O</m:t>
+                  </m:r>
+                  <m:r>
+                    <m:t>R</m:t>
+                  </m:r>
+                  <m:r>
+                    <m:t>T</m:t>
+                  </m:r>
+                </m:e>
+              </m:acc>
+            </m:e>
+            <m:sub>
+              <m:r>
+                <m:t>i</m:t>
+              </m:r>
+            </m:sub>
+          </m:sSub>
+          <m:r>
+            <m:rPr>
+              <m:sty m:val="p"/>
+            </m:rPr>
+            <m:t>=</m:t>
+          </m:r>
+          <m:r>
+            <m:t>908</m:t>
+          </m:r>
+          <m:r>
+            <m:rPr>
+              <m:sty m:val="p"/>
+            </m:rPr>
+            <m:t>,</m:t>
+          </m:r>
+          <m:r>
+            <m:t>592</m:t>
+          </m:r>
+          <m:r>
+            <m:rPr>
+              <m:sty m:val="p"/>
+            </m:rPr>
+            <m:t>−</m:t>
+          </m:r>
+          <m:r>
+            <m:t>0</m:t>
+          </m:r>
+          <m:r>
+            <m:rPr>
+              <m:sty m:val="p"/>
+            </m:rPr>
+            <m:t>,</m:t>
+          </m:r>
+          <m:r>
+            <m:t>00404445</m:t>
+          </m:r>
+          <m:r>
+            <m:rPr>
+              <m:sty m:val="p"/>
+            </m:rPr>
+            <m:t>⋅</m:t>
+          </m:r>
+          <m:r>
+            <m:t>9187</m:t>
+          </m:r>
+          <m:r>
+            <m:rPr>
+              <m:sty m:val="p"/>
+            </m:rPr>
+            <m:t>≈</m:t>
+          </m:r>
+          <m:r>
+            <m:t>871</m:t>
+          </m:r>
+          <m:r>
+            <m:rPr>
+              <m:sty m:val="p"/>
+            </m:rPr>
+            <m:t>,</m:t>
+          </m:r>
+          <m:r>
+            <m:t>44</m:t>
+          </m:r>
+        </m:oMath>
+      </m:oMathPara>
+    </w:p>
+    <w:p>
+      <w:pPr>
+        <w:pStyle w:val="FirstParagraph"/>
+      </w:pPr>
+      <w:r>
+        <w:t xml:space="preserve">When INCC = 13249:</w:t>
+      </w:r>
+    </w:p>
+    <w:p>
+      <w:pPr>
+        <w:pStyle w:val="BodyText"/>
+      </w:pPr>
+      <m:oMathPara>
+        <m:oMathParaPr>
+          <m:jc m:val="center"/>
+        </m:oMathParaPr>
+        <m:oMath>
+          <m:sSub>
+            <m:e>
+              <m:acc>
+                <m:accPr>
+                  <m:chr m:val="̂"/>
+                </m:accPr>
+                <m:e>
+                  <m:r>
+                    <m:t>M</m:t>
+                  </m:r>
+                  <m:r>
+                    <m:t>O</m:t>
+                  </m:r>
+                  <m:r>
+                    <m:t>R</m:t>
+                  </m:r>
+                  <m:r>
+                    <m:t>T</m:t>
+                  </m:r>
+                </m:e>
+              </m:acc>
+            </m:e>
+            <m:sub>
+              <m:r>
+                <m:t>i</m:t>
+              </m:r>
+            </m:sub>
+          </m:sSub>
+          <m:r>
+            <m:rPr>
+              <m:sty m:val="p"/>
+            </m:rPr>
+            <m:t>≈</m:t>
+          </m:r>
+          <m:r>
+            <m:t>855</m:t>
+          </m:r>
+          <m:r>
+            <m:rPr>
+              <m:sty m:val="p"/>
+            </m:rPr>
+            <m:t>,</m:t>
+          </m:r>
+          <m:r>
+            <m:t>01</m:t>
+          </m:r>
+        </m:oMath>
+      </m:oMathPara>
+    </w:p>
+    <w:p>
+      <w:pPr>
+        <w:pStyle w:val="FirstParagraph"/>
+      </w:pPr>
+      <w:r>
+        <w:t xml:space="preserve">When INCC = 18187:</w:t>
+      </w:r>
+    </w:p>
+    <w:p>
+      <w:pPr>
+        <w:pStyle w:val="BodyText"/>
+      </w:pPr>
+      <m:oMathPara>
+        <m:oMathParaPr>
+          <m:jc m:val="center"/>
+        </m:oMathParaPr>
+        <m:oMath>
+          <m:sSub>
+            <m:e>
+              <m:acc>
+                <m:accPr>
+                  <m:chr m:val="̂"/>
+                </m:accPr>
+                <m:e>
+                  <m:r>
+                    <m:t>M</m:t>
+                  </m:r>
+                  <m:r>
+                    <m:t>O</m:t>
+                  </m:r>
+                  <m:r>
+                    <m:t>R</m:t>
+                  </m:r>
+                  <m:r>
+                    <m:t>T</m:t>
+                  </m:r>
+                </m:e>
+              </m:acc>
+            </m:e>
+            <m:sub>
+              <m:r>
+                <m:t>i</m:t>
+              </m:r>
+            </m:sub>
+          </m:sSub>
+          <m:r>
+            <m:rPr>
+              <m:sty m:val="p"/>
+            </m:rPr>
+            <m:t>≈</m:t>
+          </m:r>
+          <m:r>
+            <m:t>835</m:t>
+          </m:r>
+          <m:r>
+            <m:rPr>
+              <m:sty m:val="p"/>
+            </m:rPr>
+            <m:t>,</m:t>
+          </m:r>
+          <m:r>
+            <m:t>04</m:t>
+          </m:r>
+        </m:oMath>
+      </m:oMathPara>
+    </w:p>
+    <w:p>
+      <w:pPr>
+        <w:pStyle w:val="FirstParagraph"/>
+      </w:pPr>
+      <w:r>
+        <w:t xml:space="preserve">Using the estimated OLS model, we compute predicted mortality rates for different levels of income (INCC). Predictions are reported for low (min), average (mean), and high (max) income values observed in the sample.</w:t>
+      </w:r>
+      <w:r>
+        <w:t xml:space="preserve"> </w:t>
+      </w:r>
+      <w:p>
+        <w:r>
+          <w:br w:type="page"/>
+        </w:r>
+      </w:p>
+    </w:p>
+    <w:p>
+      <w:pPr>
+        <w:pStyle w:val="BodyText"/>
+      </w:pPr>
+      <w:r>
+        <w:rPr>
+          <w:b/>
+          <w:bCs/>
+        </w:rPr>
+        <w:t xml:space="preserve">2e)</w:t>
+      </w:r>
+    </w:p>
+    <w:p>
+      <w:pPr>
+        <w:pStyle w:val="BodyText"/>
+      </w:pPr>
       <w:r>
         <w:drawing>
           <wp:inline>
-            <wp:extent cx="2209800" cy="162187"/>
+            <wp:extent cx="5334000" cy="5337848"/>
             <wp:effectExtent b="0" l="0" r="0" t="0"/>
-            <wp:docPr descr="" title="" id="47" name="Picture"/>
+            <wp:docPr descr="" title="" id="41" name="Picture"/>
             <a:graphic>
               <a:graphicData uri="http://schemas.openxmlformats.org/drawingml/2006/picture">
                 <pic:pic>
                   <pic:nvPicPr>
-                    <pic:cNvPr descr="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" id="48" name="Picture"/>
+                    <pic:cNvPr descr="images/Bilde6.jpg" id="42" name="Picture"/>
                     <pic:cNvPicPr>
                       <a:picLocks noChangeArrowheads="1" noChangeAspect="1"/>
                     </pic:cNvPicPr>
                   </pic:nvPicPr>
                   <pic:blipFill>
-                    <a:blip r:embed="rId46"/>
-                    <a:stretch>
-                      <a:fillRect/>
-                    </a:stretch>
-                  </pic:blipFill>
-                  <pic:spPr bwMode="auto">
-                    <a:xfrm>
-                      <a:off x="0" y="0"/>
-                      <a:ext cx="2209800" cy="162187"/>
-                    </a:xfrm>
-                    <a:prstGeom prst="rect">
-                      <a:avLst/>
-                    </a:prstGeom>
-                    <a:noFill/>
-                    <a:ln w="9525">
-                      <a:noFill/>
-                      <a:headEnd/>
-                      <a:tailEnd/>
-                    </a:ln>
-                  </pic:spPr>
-                </pic:pic>
-              </a:graphicData>
-            </a:graphic>
-          </wp:inline>
-        </w:drawing>
-      </w:r>
-    </w:p>
-    <w:p>
-      <w:pPr>
-        <w:pStyle w:val="BodyText"/>
-      </w:pPr>
-      <w:r>
-        <w:t xml:space="preserve">INCC represents income per capita, measured in U.S. dollars for each state.</w:t>
-      </w:r>
-    </w:p>
-    <w:p>
-      <w:pPr>
-        <w:pStyle w:val="BodyText"/>
-      </w:pPr>
-      <w:r>
-        <w:t xml:space="preserve">In our dataset:</w:t>
-      </w:r>
-    </w:p>
-    <w:p>
-      <w:pPr>
-        <w:pStyle w:val="BodyText"/>
-      </w:pPr>
-      <w:r>
-        <w:t xml:space="preserve">INCC min = 9187</w:t>
-      </w:r>
-    </w:p>
-    <w:p>
-      <w:pPr>
-        <w:pStyle w:val="BodyText"/>
-      </w:pPr>
-      <w:r>
-        <w:t xml:space="preserve">INCC mean = 13249</w:t>
-      </w:r>
-    </w:p>
-    <w:p>
-      <w:pPr>
-        <w:pStyle w:val="BodyText"/>
-      </w:pPr>
-      <w:r>
-        <w:t xml:space="preserve">INCC max = 18187</w:t>
-      </w:r>
-    </w:p>
-    <w:p>
-      <w:pPr>
-        <w:pStyle w:val="BodyText"/>
-      </w:pPr>
-      <w:r>
-        <w:t xml:space="preserve">Substitute into the equation:</w:t>
-      </w:r>
-    </w:p>
-    <w:p>
-      <w:pPr>
-        <w:pStyle w:val="BodyText"/>
-      </w:pPr>
-      <w:r>
-        <w:t xml:space="preserve">When INCC = 9187:</w:t>
-      </w:r>
-      <w:r>
-        <w:t xml:space="preserve"> </w:t>
-      </w:r>
-      <w:r>
-        <w:drawing>
-          <wp:inline>
-            <wp:extent cx="2924175" cy="171505"/>
-            <wp:effectExtent b="0" l="0" r="0" t="0"/>
-            <wp:docPr descr="" title="" id="50" name="Picture"/>
-            <a:graphic>
-              <a:graphicData uri="http://schemas.openxmlformats.org/drawingml/2006/picture">
-                <pic:pic>
-                  <pic:nvPicPr>
-                    <pic:cNvPr descr="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" id="51" name="Picture"/>
-                    <pic:cNvPicPr>
-                      <a:picLocks noChangeArrowheads="1" noChangeAspect="1"/>
-                    </pic:cNvPicPr>
-                  </pic:nvPicPr>
-                  <pic:blipFill>
-                    <a:blip r:embed="rId49"/>
-                    <a:stretch>
-                      <a:fillRect/>
-                    </a:stretch>
-                  </pic:blipFill>
-                  <pic:spPr bwMode="auto">
-                    <a:xfrm>
-                      <a:off x="0" y="0"/>
-                      <a:ext cx="2924175" cy="171505"/>
-                    </a:xfrm>
-                    <a:prstGeom prst="rect">
-                      <a:avLst/>
-                    </a:prstGeom>
-                    <a:noFill/>
-                    <a:ln w="9525">
-                      <a:noFill/>
-                      <a:headEnd/>
-                      <a:tailEnd/>
-                    </a:ln>
-                  </pic:spPr>
-                </pic:pic>
-              </a:graphicData>
-            </a:graphic>
-          </wp:inline>
-        </w:drawing>
-      </w:r>
-    </w:p>
-    <w:p>
-      <w:pPr>
-        <w:pStyle w:val="BodyText"/>
-      </w:pPr>
-      <w:r>
-        <w:t xml:space="preserve">When INCC = 13249:</w:t>
-      </w:r>
-      <w:r>
-        <w:t xml:space="preserve"> </w:t>
-      </w:r>
-      <w:r>
-        <w:drawing>
-          <wp:inline>
-            <wp:extent cx="933450" cy="171450"/>
-            <wp:effectExtent b="0" l="0" r="0" t="0"/>
-            <wp:docPr descr="" title="" id="53" name="Picture"/>
-            <a:graphic>
-              <a:graphicData uri="http://schemas.openxmlformats.org/drawingml/2006/picture">
-                <pic:pic>
-                  <pic:nvPicPr>
-                    <pic:cNvPr descr="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" id="54" name="Picture"/>
-                    <pic:cNvPicPr>
-                      <a:picLocks noChangeArrowheads="1" noChangeAspect="1"/>
-                    </pic:cNvPicPr>
-                  </pic:nvPicPr>
-                  <pic:blipFill>
-                    <a:blip r:embed="rId52"/>
-                    <a:stretch>
-                      <a:fillRect/>
-                    </a:stretch>
-                  </pic:blipFill>
-                  <pic:spPr bwMode="auto">
-                    <a:xfrm>
-                      <a:off x="0" y="0"/>
-                      <a:ext cx="933450" cy="171450"/>
-                    </a:xfrm>
-                    <a:prstGeom prst="rect">
-                      <a:avLst/>
-                    </a:prstGeom>
-                    <a:noFill/>
-                    <a:ln w="9525">
-                      <a:noFill/>
-                      <a:headEnd/>
-                      <a:tailEnd/>
-                    </a:ln>
-                  </pic:spPr>
-                </pic:pic>
-              </a:graphicData>
-            </a:graphic>
-          </wp:inline>
-        </w:drawing>
-      </w:r>
-    </w:p>
-    <w:p>
-      <w:pPr>
-        <w:pStyle w:val="BodyText"/>
-      </w:pPr>
-      <w:r>
-        <w:t xml:space="preserve">When INCC = 18187:</w:t>
-      </w:r>
-      <w:r>
-        <w:t xml:space="preserve"> </w:t>
-      </w:r>
-      <w:r>
-        <w:drawing>
-          <wp:inline>
-            <wp:extent cx="933450" cy="171450"/>
-            <wp:effectExtent b="0" l="0" r="0" t="0"/>
-            <wp:docPr descr="" title="" id="56" name="Picture"/>
-            <a:graphic>
-              <a:graphicData uri="http://schemas.openxmlformats.org/drawingml/2006/picture">
-                <pic:pic>
-                  <pic:nvPicPr>
-                    <pic:cNvPr descr="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" id="57" name="Picture"/>
-                    <pic:cNvPicPr>
-                      <a:picLocks noChangeArrowheads="1" noChangeAspect="1"/>
-                    </pic:cNvPicPr>
-                  </pic:nvPicPr>
-                  <pic:blipFill>
-                    <a:blip r:embed="rId55"/>
-                    <a:stretch>
-                      <a:fillRect/>
-                    </a:stretch>
-                  </pic:blipFill>
-                  <pic:spPr bwMode="auto">
-                    <a:xfrm>
-                      <a:off x="0" y="0"/>
-                      <a:ext cx="933450" cy="171450"/>
-                    </a:xfrm>
-                    <a:prstGeom prst="rect">
-                      <a:avLst/>
-                    </a:prstGeom>
-                    <a:noFill/>
-                    <a:ln w="9525">
-                      <a:noFill/>
-                      <a:headEnd/>
-                      <a:tailEnd/>
-                    </a:ln>
-                  </pic:spPr>
-                </pic:pic>
-              </a:graphicData>
-            </a:graphic>
-          </wp:inline>
-        </w:drawing>
-      </w:r>
-    </w:p>
-    <w:p>
-      <w:pPr>
-        <w:pStyle w:val="BodyText"/>
-      </w:pPr>
-      <w:r>
-        <w:t xml:space="preserve">Using the estimated OLS model, we compute predicted mortality rates for different levels of income (INCC). Predictions are reported for low (min), average (mean), and high (max) income values observed in the sample.</w:t>
-      </w:r>
-      <w:r>
-        <w:t xml:space="preserve"> </w:t>
-      </w:r>
-      <w:p>
-        <w:r>
-          <w:br w:type="page"/>
-        </w:r>
-      </w:p>
-    </w:p>
-    <w:p>
-      <w:pPr>
-        <w:pStyle w:val="BodyText"/>
-      </w:pPr>
-      <w:r>
-        <w:rPr>
-          <w:b/>
-          <w:bCs/>
-        </w:rPr>
-        <w:t xml:space="preserve">2e)</w:t>
-      </w:r>
-    </w:p>
-    <w:p>
-      <w:pPr>
-        <w:pStyle w:val="BodyText"/>
-      </w:pPr>
-      <w:r>
-        <w:drawing>
-          <wp:inline>
-            <wp:extent cx="5334000" cy="5337848"/>
-            <wp:effectExtent b="0" l="0" r="0" t="0"/>
-            <wp:docPr descr="" title="" id="59" name="Picture"/>
-            <a:graphic>
-              <a:graphicData uri="http://schemas.openxmlformats.org/drawingml/2006/picture">
-                <pic:pic>
-                  <pic:nvPicPr>
-                    <pic:cNvPr descr="images/Bilde6.jpg" id="60" name="Picture"/>
-                    <pic:cNvPicPr>
-                      <a:picLocks noChangeArrowheads="1" noChangeAspect="1"/>
-                    </pic:cNvPicPr>
-                  </pic:nvPicPr>
-                  <pic:blipFill>
-                    <a:blip r:embed="rId58"/>
+                    <a:blip r:embed="rId40"/>
                     <a:stretch>
                       <a:fillRect/>
                     </a:stretch>
@@ -994,117 +1126,89 @@
       <w:r>
         <w:t xml:space="preserve"> </w:t>
       </w:r>
+      <m:oMath>
+        <m:sSup>
+          <m:e>
+            <m:r>
+              <m:t>r</m:t>
+            </m:r>
+          </m:e>
+          <m:sup>
+            <m:r>
+              <m:t>2</m:t>
+            </m:r>
+          </m:sup>
+        </m:sSup>
+      </m:oMath>
+      <w:r>
+        <w:t xml:space="preserve">. This means that the model explains pretty much none of the variation of the mortality. That means that we can’t use income as a regressor for simple regression to explain what leads to a higher mortality rate.</w:t>
+      </w:r>
+      <w:r>
+        <w:t xml:space="preserve"> </w:t>
+      </w:r>
+      <w:p>
+        <w:r>
+          <w:br w:type="page"/>
+        </w:r>
+      </w:p>
+    </w:p>
+    <w:bookmarkEnd w:id="43"/>
+    <w:bookmarkStart w:id="47" w:name="multiple-regression"/>
+    <w:p>
+      <w:pPr>
+        <w:pStyle w:val="Heading1"/>
+      </w:pPr>
+      <w:r>
+        <w:t xml:space="preserve">3. Multiple regression</w:t>
+      </w:r>
+    </w:p>
+    <w:p>
+      <w:pPr>
+        <w:pStyle w:val="FirstParagraph"/>
+      </w:pPr>
+      <w:r>
+        <w:rPr>
+          <w:b/>
+          <w:bCs/>
+        </w:rPr>
+        <w:t xml:space="preserve">a)</w:t>
+      </w:r>
+      <w:r>
+        <w:t xml:space="preserve"> </w:t>
+      </w:r>
+      <w:r>
+        <w:t xml:space="preserve">Our dependent variable is still mortality. Our additional variables are: INCC, AGED, TOBC and EDU2. INCC, per capita income, is included as the main explanatory variable of interest.The reason for choosing EDU2 over EDU1 as to complete 4 years of college, you would have to complete high school or other equivalents. We expect that there would be a minor difference between a college and no college education. Economic theories and empirical research questions suggest that higher incomes are associated with better access to healthcare and improved living situations and healthier lifestyles. AGED, is the proportion of the population aged over 65 years, is included because mortality rates are naturally higher in states with older populations. Controlling for age structures ensures that the estimated effect of income is simply capturing demographic differences across states. TOBC, cigarette consumption per capita, is included because smoking is a major risk factor for mortality. Differences in smoking behavior across states may influence mortality independently of income. EDU2, the proportion of the population completing 4 or more years of college, is included as a proxy for human capital and health related behavior. Higher education levels are generally associated with better health awareness, better access to healthcare and healthier lifestyles. Including these variables allows our coefficient on INCC to be interpreted as the partial effect of income on mortality, holding age structure, smoking behavior, and education constant.</w:t>
+      </w:r>
+      <w:r>
+        <w:t xml:space="preserve"> </w:t>
+      </w:r>
+      <w:p>
+        <w:r>
+          <w:br w:type="page"/>
+        </w:r>
+      </w:p>
+    </w:p>
+    <w:p>
+      <w:pPr>
+        <w:pStyle w:val="FirstParagraph"/>
+      </w:pPr>
       <w:r>
         <w:drawing>
           <wp:inline>
-            <wp:extent cx="152400" cy="160866"/>
+            <wp:extent cx="5334000" cy="3359097"/>
             <wp:effectExtent b="0" l="0" r="0" t="0"/>
-            <wp:docPr descr="" title="" id="62" name="Picture"/>
+            <wp:docPr descr="" title="" id="45" name="Picture"/>
             <a:graphic>
               <a:graphicData uri="http://schemas.openxmlformats.org/drawingml/2006/picture">
                 <pic:pic>
                   <pic:nvPicPr>
-                    <pic:cNvPr descr="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" id="63" name="Picture"/>
+                    <pic:cNvPr descr="images/Bilde7.png" id="46" name="Picture"/>
                     <pic:cNvPicPr>
                       <a:picLocks noChangeArrowheads="1" noChangeAspect="1"/>
                     </pic:cNvPicPr>
                   </pic:nvPicPr>
                   <pic:blipFill>
-                    <a:blip r:embed="rId61"/>
-                    <a:stretch>
-                      <a:fillRect/>
-                    </a:stretch>
-                  </pic:blipFill>
-                  <pic:spPr bwMode="auto">
-                    <a:xfrm>
-                      <a:off x="0" y="0"/>
-                      <a:ext cx="152400" cy="160866"/>
-                    </a:xfrm>
-                    <a:prstGeom prst="rect">
-                      <a:avLst/>
-                    </a:prstGeom>
-                    <a:noFill/>
-                    <a:ln w="9525">
-                      <a:noFill/>
-                      <a:headEnd/>
-                      <a:tailEnd/>
-                    </a:ln>
-                  </pic:spPr>
-                </pic:pic>
-              </a:graphicData>
-            </a:graphic>
-          </wp:inline>
-        </w:drawing>
-      </w:r>
-      <w:r>
-        <w:t xml:space="preserve">. This means that the model explains pretty much none of the variation of the mortality. That means that we can’t use income as a regressor for simple regression to explain what leads to a higher mortality rate.</w:t>
-      </w:r>
-      <w:r>
-        <w:t xml:space="preserve"> </w:t>
-      </w:r>
-      <w:p>
-        <w:r>
-          <w:br w:type="page"/>
-        </w:r>
-      </w:p>
-    </w:p>
-    <w:bookmarkEnd w:id="64"/>
-    <w:bookmarkStart w:id="77" w:name="multiple-regression"/>
-    <w:p>
-      <w:pPr>
-        <w:pStyle w:val="Heading1"/>
-      </w:pPr>
-      <w:r>
-        <w:t xml:space="preserve">3. Multiple regression</w:t>
-      </w:r>
-    </w:p>
-    <w:p>
-      <w:pPr>
-        <w:pStyle w:val="FirstParagraph"/>
-      </w:pPr>
-      <w:r>
-        <w:rPr>
-          <w:b/>
-          <w:bCs/>
-        </w:rPr>
-        <w:t xml:space="preserve">a)</w:t>
-      </w:r>
-      <w:r>
-        <w:t xml:space="preserve"> </w:t>
-      </w:r>
-      <w:r>
-        <w:t xml:space="preserve">Our dependent variable is still mortality. Our additional variables are: INCC, AGED, TOBC and EDU2. INCC, per capita income, is included as the main explanatory variable of interest.The reason for choosing EDU2 over EDU1 as to complete 4 years of college, you would have to complete high school or other equivalents. We expect that there would be a minor difference between a college and no college education. Economic theories and empirical research questions suggest that higher incomes are associated with better access to healthcare and improved living situations and healthier lifestyles. AGED, is the proportion of the population aged over 65 years, is included because mortality rates are naturally higher in states with older populations. Controlling for age structures ensures that the estimated effect of income is simply capturing demographic differences across states. TOBC, cigarette consumption per capita, is included because smoking is a major risk factor for mortality. Differences in smoking behavior across states may influence mortality independently of income. EDU2, the proportion of the population completing 4 or more years of college, is included as a proxy for human capital and health related behavior.  Higher education levels are generally associated with better health awareness, better access to healthcare and healthier lifestyles. Including these variables allows our coefficient on INCC to be interpreted as the partial effect of income on mortality, holding age structure, smoking behavior, and education constant.</w:t>
-      </w:r>
-      <w:r>
-        <w:t xml:space="preserve"> </w:t>
-      </w:r>
-      <w:p>
-        <w:r>
-          <w:br w:type="page"/>
-        </w:r>
-      </w:p>
-    </w:p>
-    <w:p>
-      <w:pPr>
-        <w:pStyle w:val="FirstParagraph"/>
-      </w:pPr>
-      <w:r>
-        <w:drawing>
-          <wp:inline>
-            <wp:extent cx="5334000" cy="3359097"/>
-            <wp:effectExtent b="0" l="0" r="0" t="0"/>
-            <wp:docPr descr="" title="" id="66" name="Picture"/>
-            <a:graphic>
-              <a:graphicData uri="http://schemas.openxmlformats.org/drawingml/2006/picture">
-                <pic:pic>
-                  <pic:nvPicPr>
-                    <pic:cNvPr descr="images/Bilde7.png" id="67" name="Picture"/>
-                    <pic:cNvPicPr>
-                      <a:picLocks noChangeArrowheads="1" noChangeAspect="1"/>
-                    </pic:cNvPicPr>
-                  </pic:nvPicPr>
-                  <pic:blipFill>
-                    <a:blip r:embed="rId65"/>
+                    <a:blip r:embed="rId44"/>
                     <a:stretch>
                       <a:fillRect/>
                     </a:stretch>
@@ -1210,335 +1314,197 @@
         <w:t xml:space="preserve"> </w:t>
       </w:r>
       <w:r>
-        <w:t xml:space="preserve">The coefficient on INCC is 0.00466. This implies that per one dollar that  increases in per capita, income is associated with an increase of 0.00466 in the mortality rate, holding other variables constant. Interpreting this per $1000 increase: </w:t>
+        <w:t xml:space="preserve">The coefficient on INCC is 0.00466. This implies that per one dollar that increases in per capita, income is associated with an increase of 0.00466 in the mortality rate, holding other variables constant. Interpreting this per $1000 increase: 1000*0.0466=4.66</w:t>
+      </w:r>
+    </w:p>
+    <w:p>
+      <w:pPr>
+        <w:pStyle w:val="BodyText"/>
+      </w:pPr>
+      <w:r>
+        <w:t xml:space="preserve">Thus, a $1000 increase in per capita income is associated with an increase of approximately 4.66 deaths per 100,000 population, holding age structure, smoking, and education constant. However, this effect must be evaluated in terms of statistical significance.</w:t>
+      </w:r>
+    </w:p>
+    <w:p>
+      <w:pPr>
+        <w:pStyle w:val="BodyText"/>
+      </w:pPr>
+      <w:r>
+        <w:t xml:space="preserve">The coefficient on EDU2 is –174.61. Since EDU2 is measured as a proportion, a 0.01 (one percentage point) increase in the share of college-educated individuals changes mortality by:-174.61*0.01=-1.75</w:t>
+      </w:r>
+    </w:p>
+    <w:p>
+      <w:pPr>
+        <w:pStyle w:val="BodyText"/>
+      </w:pPr>
+      <w:r>
+        <w:t xml:space="preserve">Thus, a one percentage point increase in college education is associated with a reduction of approximately 1.75 deaths per 100,000 population, holding other factors constant.</w:t>
+      </w:r>
+    </w:p>
+    <w:p>
+      <w:pPr>
+        <w:pStyle w:val="BodyText"/>
+      </w:pPr>
+      <w:r>
+        <w:t xml:space="preserve">The coefficient on TOBC is 1.3856, indicating that higher cigarette consumption is associated with higher mortality. A one-unit increase in cigarette consumption increases predicted mortality by approximately 1.39 deaths per 100,000 population, holding other variables constant.</w:t>
+      </w:r>
+    </w:p>
+    <w:p>
+      <w:pPr>
+        <w:pStyle w:val="BodyText"/>
+      </w:pPr>
+      <w:r>
+        <w:t xml:space="preserve">The coefficient on AGED is 5432.88. Since AGED is measured as a proportion, a 0.01 (one percentage point) increase in the share of the population over 65 increases mortality by:5432.88*0.01=54.33</w:t>
+      </w:r>
+    </w:p>
+    <w:p>
+      <w:pPr>
+        <w:pStyle w:val="BodyText"/>
+      </w:pPr>
+      <w:r>
+        <w:t xml:space="preserve">Thus, a one percentage point increase in the elderly population is associated with approximately 54 additional deaths per 100,000 population, holding other variables constant. This is as expected as most common source of death in the US in 2023 was heart disease (National Center for Health Statistics, u.d.), and its more prevalent in the older population (Maddalena Lettino, 2022). If we also consider our everyday life and situation we most often hear of elderly people passing away. It thus provides further evidence for our everyday belief of older age being the largest contributor to old age.</w:t>
+      </w:r>
+    </w:p>
+    <w:p>
+      <w:r>
+        <w:br w:type="page"/>
+      </w:r>
+    </w:p>
+    <w:p>
+      <w:pPr>
+        <w:pStyle w:val="BodyText"/>
+      </w:pPr>
+      <w:r>
+        <w:rPr>
+          <w:b/>
+          <w:bCs/>
+        </w:rPr>
+        <w:t xml:space="preserve">d)</w:t>
+      </w:r>
+    </w:p>
+    <w:p>
+      <w:pPr>
+        <w:pStyle w:val="BodyText"/>
+      </w:pPr>
+      <w:r>
+        <w:t xml:space="preserve">To evaluate the statistical significance of the independent variables, we examine their p-values at the 5% significance level. A variable is considered statistically significant if its p-value is below 0,005.</w:t>
+      </w:r>
+    </w:p>
+    <w:p>
+      <w:pPr>
+        <w:pStyle w:val="BodyText"/>
+      </w:pPr>
+      <w:r>
+        <w:t xml:space="preserve">From the regression results, the variables TOBC and AGED are statistically significant, with p-values of 0,0026 and 3,98e-16 respectively. This indicates that cigarette consumption and the proportion of the population over age 65 have a statistically significant association with mortality rates across states.</w:t>
+      </w:r>
+    </w:p>
+    <w:p>
+      <w:pPr>
+        <w:pStyle w:val="BodyText"/>
+      </w:pPr>
+      <w:r>
+        <w:t xml:space="preserve">In contrast, the variables INCC and EDU2 have p-values of 0,04643 and 0,6970, which are both greater than 0,05. Therefore, we fail to reject the null hypothesis that their coefficients are equal to zero. This suggests that income per capita and the share of college-educated individuals do not have statistically significant effect on mortality in this model.</w:t>
+      </w:r>
+    </w:p>
+    <w:p>
+      <w:pPr>
+        <w:pStyle w:val="BodyText"/>
+      </w:pPr>
+      <w:r>
+        <w:rPr>
+          <w:b/>
+          <w:bCs/>
+        </w:rPr>
+        <w:t xml:space="preserve">e)</w:t>
       </w:r>
       <w:r>
         <w:t xml:space="preserve"> </w:t>
       </w:r>
+      <w:r>
+        <w:t xml:space="preserve">Compared to the simple regression model, the multiple regression model provides a substantially better fit. In the simple regression, where mortality was explained only by income, the R-squared was approximately 0,004, indicating that income alone explained almost none of the variation in mortality across states.</w:t>
+      </w:r>
+    </w:p>
+    <w:p>
+      <w:pPr>
+        <w:pStyle w:val="BodyText"/>
+      </w:pPr>
+      <w:r>
+        <w:t xml:space="preserve">In the multiple regression model, the R-squared increases to 0,819, meaning that approximately 81,9% of the variation in mortality rates can be explained by the included variables. This suggests that mortality is influenced by several socioeconomic and health-related factors than income alone.</w:t>
+      </w:r>
+    </w:p>
+    <w:p>
+      <w:pPr>
+        <w:pStyle w:val="BodyText"/>
+      </w:pPr>
+      <w:r>
+        <w:t xml:space="preserve">We also saw the effect of omitted variable bias when going from a simple regression to a multiple regression. We saw that there was a change from a negative value to a positive one. The bias that where prevalent in this set is negative due to the slope-coefficient in simple regression being negative subtracted by the positive multiple regression slope, giving a final negative value, and thus and negative bias. Another factor to consider is that in states with an older population there is likely an higher income as well.</w:t>
+      </w:r>
+    </w:p>
+    <w:p>
+      <w:pPr>
+        <w:pStyle w:val="BodyText"/>
+      </w:pPr>
+      <w:r>
+        <w:t xml:space="preserve">The inclusion of variables such as cigarette consumption and the share of elderly population significantly improves the explanatory power of the model, highlighting the importance of considering multiple determinants when analyzing moratity differences across states.</w:t>
+      </w:r>
+      <w:r>
+        <w:t xml:space="preserve"> </w:t>
+      </w:r>
+      <w:p>
+        <w:r>
+          <w:br w:type="page"/>
+        </w:r>
+      </w:p>
+    </w:p>
+    <w:bookmarkEnd w:id="47"/>
+    <w:bookmarkStart w:id="60" w:name="dummy-variable-analysis"/>
+    <w:p>
+      <w:pPr>
+        <w:pStyle w:val="Heading1"/>
+      </w:pPr>
+      <w:r>
+        <w:t xml:space="preserve">4.1 Dummy Variable Analysis</w:t>
+      </w:r>
+    </w:p>
+    <w:p>
+      <w:pPr>
+        <w:pStyle w:val="FirstParagraph"/>
+      </w:pPr>
+      <w:r>
+        <w:rPr>
+          <w:b/>
+          <w:bCs/>
+        </w:rPr>
+        <w:t xml:space="preserve">A)</w:t>
+      </w:r>
+      <w:r>
+        <w:t xml:space="preserve"> </w:t>
+      </w:r>
+      <w:r>
+        <w:t xml:space="preserve">We saw that income had a negative effect on mortality. Now we want to find out if there is a threshold where it changes? Therefore, we made a dummy variable where we set the mean as the threshold for effect the dummy variable. The mean where 13249.2, and it was set to be higher than mean income. We have seen that if the income is higher.</w:t>
+      </w:r>
+    </w:p>
+    <w:p>
+      <w:pPr>
+        <w:pStyle w:val="BodyText"/>
+      </w:pPr>
       <w:r>
         <w:drawing>
           <wp:inline>
-            <wp:extent cx="1133475" cy="133764"/>
+            <wp:extent cx="5334000" cy="2969867"/>
             <wp:effectExtent b="0" l="0" r="0" t="0"/>
-            <wp:docPr descr="" title="" id="69" name="Picture"/>
+            <wp:docPr descr="" title="" id="49" name="Picture"/>
             <a:graphic>
               <a:graphicData uri="http://schemas.openxmlformats.org/drawingml/2006/picture">
                 <pic:pic>
                   <pic:nvPicPr>
-                    <pic:cNvPr descr="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" id="70" name="Picture"/>
+                    <pic:cNvPr descr="images/Bilde8.png" id="50" name="Picture"/>
                     <pic:cNvPicPr>
                       <a:picLocks noChangeArrowheads="1" noChangeAspect="1"/>
                     </pic:cNvPicPr>
                   </pic:nvPicPr>
                   <pic:blipFill>
-                    <a:blip r:embed="rId68"/>
-                    <a:stretch>
-                      <a:fillRect/>
-                    </a:stretch>
-                  </pic:blipFill>
-                  <pic:spPr bwMode="auto">
-                    <a:xfrm>
-                      <a:off x="0" y="0"/>
-                      <a:ext cx="1133475" cy="133764"/>
-                    </a:xfrm>
-                    <a:prstGeom prst="rect">
-                      <a:avLst/>
-                    </a:prstGeom>
-                    <a:noFill/>
-                    <a:ln w="9525">
-                      <a:noFill/>
-                      <a:headEnd/>
-                      <a:tailEnd/>
-                    </a:ln>
-                  </pic:spPr>
-                </pic:pic>
-              </a:graphicData>
-            </a:graphic>
-          </wp:inline>
-        </w:drawing>
-      </w:r>
-      <w:r>
-        <w:br/>
-      </w:r>
-    </w:p>
-    <w:p>
-      <w:pPr>
-        <w:pStyle w:val="BodyText"/>
-      </w:pPr>
-      <w:r>
-        <w:t xml:space="preserve">Thus, a $1000 increase in per capita income is associated with an increase of approximately 4.66 deaths per 100,000 population, holding age structure, smoking, and education constant. However, this effect must be evaluated in terms of statistical significance.</w:t>
-      </w:r>
-    </w:p>
-    <w:p>
-      <w:pPr>
-        <w:pStyle w:val="BodyText"/>
-      </w:pPr>
-      <w:r>
-        <w:t xml:space="preserve">The coefficient on EDU2 is –174.61. Since EDU2 is measured as a proportion, a 0.01 (one percentage point) increase in the share of college-educated individuals changes mortality by:</w:t>
-      </w:r>
-      <w:r>
-        <w:t xml:space="preserve"> </w:t>
-      </w:r>
-      <w:r>
-        <w:drawing>
-          <wp:inline>
-            <wp:extent cx="1371600" cy="152846"/>
-            <wp:effectExtent b="0" l="0" r="0" t="0"/>
-            <wp:docPr descr="" title="" id="72" name="Picture"/>
-            <a:graphic>
-              <a:graphicData uri="http://schemas.openxmlformats.org/drawingml/2006/picture">
-                <pic:pic>
-                  <pic:nvPicPr>
-                    <pic:cNvPr descr="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" id="73" name="Picture"/>
-                    <pic:cNvPicPr>
-                      <a:picLocks noChangeArrowheads="1" noChangeAspect="1"/>
-                    </pic:cNvPicPr>
-                  </pic:nvPicPr>
-                  <pic:blipFill>
-                    <a:blip r:embed="rId71"/>
-                    <a:stretch>
-                      <a:fillRect/>
-                    </a:stretch>
-                  </pic:blipFill>
-                  <pic:spPr bwMode="auto">
-                    <a:xfrm>
-                      <a:off x="0" y="0"/>
-                      <a:ext cx="1371600" cy="152846"/>
-                    </a:xfrm>
-                    <a:prstGeom prst="rect">
-                      <a:avLst/>
-                    </a:prstGeom>
-                    <a:noFill/>
-                    <a:ln w="9525">
-                      <a:noFill/>
-                      <a:headEnd/>
-                      <a:tailEnd/>
-                    </a:ln>
-                  </pic:spPr>
-                </pic:pic>
-              </a:graphicData>
-            </a:graphic>
-          </wp:inline>
-        </w:drawing>
-      </w:r>
-    </w:p>
-    <w:p>
-      <w:pPr>
-        <w:pStyle w:val="BodyText"/>
-      </w:pPr>
-      <w:r>
-        <w:t xml:space="preserve">Thus, a one percentage point increase in college education is associated with a reduction of approximately 1.75 deaths per 100,000 population, holding other factors constant.</w:t>
-      </w:r>
-    </w:p>
-    <w:p>
-      <w:pPr>
-        <w:pStyle w:val="BodyText"/>
-      </w:pPr>
-      <w:r>
-        <w:t xml:space="preserve">The coefficient on TOBC is 1.3856, indicating that higher cigarette consumption is associated with higher mortality. A one-unit increase in cigarette consumption increases predicted mortality by approximately 1.39 deaths per 100,000 population, holding other variables constant.</w:t>
-      </w:r>
-    </w:p>
-    <w:p>
-      <w:pPr>
-        <w:pStyle w:val="BodyText"/>
-      </w:pPr>
-      <w:r>
-        <w:t xml:space="preserve">The coefficient on AGED is 5432.88. Since AGED is measured as a proportion, a 0.01 (one percentage point) increase in the share of the population over 65 increases mortality by:</w:t>
-      </w:r>
-      <w:r>
-        <w:t xml:space="preserve"> </w:t>
-      </w:r>
-      <w:r>
-        <w:drawing>
-          <wp:inline>
-            <wp:extent cx="1400175" cy="161722"/>
-            <wp:effectExtent b="0" l="0" r="0" t="0"/>
-            <wp:docPr descr="" title="" id="75" name="Picture"/>
-            <a:graphic>
-              <a:graphicData uri="http://schemas.openxmlformats.org/drawingml/2006/picture">
-                <pic:pic>
-                  <pic:nvPicPr>
-                    <pic:cNvPr descr="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" id="76" name="Picture"/>
-                    <pic:cNvPicPr>
-                      <a:picLocks noChangeArrowheads="1" noChangeAspect="1"/>
-                    </pic:cNvPicPr>
-                  </pic:nvPicPr>
-                  <pic:blipFill>
-                    <a:blip r:embed="rId74"/>
-                    <a:stretch>
-                      <a:fillRect/>
-                    </a:stretch>
-                  </pic:blipFill>
-                  <pic:spPr bwMode="auto">
-                    <a:xfrm>
-                      <a:off x="0" y="0"/>
-                      <a:ext cx="1400175" cy="161722"/>
-                    </a:xfrm>
-                    <a:prstGeom prst="rect">
-                      <a:avLst/>
-                    </a:prstGeom>
-                    <a:noFill/>
-                    <a:ln w="9525">
-                      <a:noFill/>
-                      <a:headEnd/>
-                      <a:tailEnd/>
-                    </a:ln>
-                  </pic:spPr>
-                </pic:pic>
-              </a:graphicData>
-            </a:graphic>
-          </wp:inline>
-        </w:drawing>
-      </w:r>
-    </w:p>
-    <w:p>
-      <w:pPr>
-        <w:pStyle w:val="BodyText"/>
-      </w:pPr>
-      <w:r>
-        <w:t xml:space="preserve">Thus, a one percentage point increase in the elderly population is associated with approximately 54 additional deaths per 100,000 population, holding other variables constant. This is as expected as most common source of death in the US in 2023 was heart disease (National Center for Health Statistics, u.d.), and its more prevalent in the older population (Maddalena Lettino, 2022). If we also consider our everyday life and situation we most often hear of elderly people passing away. It thus provides further evidence for our everyday belief of older age being the largest contributor to old age.</w:t>
-      </w:r>
-    </w:p>
-    <w:p>
-      <w:r>
-        <w:br w:type="page"/>
-      </w:r>
-    </w:p>
-    <w:p>
-      <w:pPr>
-        <w:pStyle w:val="BodyText"/>
-      </w:pPr>
-      <w:r>
-        <w:rPr>
-          <w:b/>
-          <w:bCs/>
-        </w:rPr>
-        <w:t xml:space="preserve">d)</w:t>
-      </w:r>
-    </w:p>
-    <w:p>
-      <w:pPr>
-        <w:pStyle w:val="BodyText"/>
-      </w:pPr>
-      <w:r>
-        <w:t xml:space="preserve">To evaluate the statistical significance of the independent variables, we examine their p-values at the 5% significance level. A variable is considered statistically significant if its p-value is below 0,005.</w:t>
-      </w:r>
-    </w:p>
-    <w:p>
-      <w:pPr>
-        <w:pStyle w:val="BodyText"/>
-      </w:pPr>
-      <w:r>
-        <w:t xml:space="preserve">From the regression results, the variables TOBC and AGED are statistically significant, with p-values of 0,0026 and 3,98e-16 respectively. This indicates that cigarette consumption and the proportion of the population over age 65 have a statistically significant association with mortality rates across states.</w:t>
-      </w:r>
-    </w:p>
-    <w:p>
-      <w:pPr>
-        <w:pStyle w:val="BodyText"/>
-      </w:pPr>
-      <w:r>
-        <w:t xml:space="preserve">In contrast, the variables INCC and EDU2 have p-values of 0,04643 and 0,6970, which are both greater than 0,05. Therefore, we fail to reject the null hypothesis that their coefficients are equal to zero. This suggests that income per capita and the share of college-educated individuals do not have statistically significant effect on mortality in this model.</w:t>
-      </w:r>
-    </w:p>
-    <w:p>
-      <w:pPr>
-        <w:pStyle w:val="BodyText"/>
-      </w:pPr>
-      <w:r>
-        <w:rPr>
-          <w:b/>
-          <w:bCs/>
-        </w:rPr>
-        <w:t xml:space="preserve">e)</w:t>
-      </w:r>
-      <w:r>
-        <w:t xml:space="preserve"> </w:t>
-      </w:r>
-      <w:r>
-        <w:t xml:space="preserve">Compared to the simple regression model, the multiple regression model provides a substantially better fit. In the simple regression, where mortality was explained only by income, the R-squared was approximately 0,004, indicating that income alone explained almost none of the variation in mortality across states.</w:t>
-      </w:r>
-    </w:p>
-    <w:p>
-      <w:pPr>
-        <w:pStyle w:val="BodyText"/>
-      </w:pPr>
-      <w:r>
-        <w:t xml:space="preserve">In the multiple regression model, the R-squared increases to 0,819, meaning that approximately 81,9% of the variation in mortality rates can be explained by the included variables. This suggests that mortality is influenced by several socioeconomic and health-related factors than income alone.</w:t>
-      </w:r>
-    </w:p>
-    <w:p>
-      <w:pPr>
-        <w:pStyle w:val="BodyText"/>
-      </w:pPr>
-      <w:r>
-        <w:t xml:space="preserve">We also saw the effect of omitted variable bias when going from a simple regression to a multiple regression. We saw that there was a change from a negative value to a positive one. The bias that where prevalent in this set is negative due to the slope-coefficient in simple regression being negative subtracted by the positive multiple regression slope, giving a final negative value, and thus and negative bias. Another factor to consider is that in states with an older population there is likely an higher income as well.</w:t>
-      </w:r>
-    </w:p>
-    <w:p>
-      <w:pPr>
-        <w:pStyle w:val="BodyText"/>
-      </w:pPr>
-      <w:r>
-        <w:t xml:space="preserve">The inclusion of variables such as cigarette consumption and the share of elderly population significantly improves the explanatory power of the model, highlighting the importance of considering multiple determinants when analyzing moratity differences across states.</w:t>
-      </w:r>
-      <w:r>
-        <w:t xml:space="preserve"> </w:t>
-      </w:r>
-      <w:p>
-        <w:r>
-          <w:br w:type="page"/>
-        </w:r>
-      </w:p>
-    </w:p>
-    <w:bookmarkEnd w:id="77"/>
-    <w:bookmarkStart w:id="90" w:name="dummy-variable-analysis"/>
-    <w:p>
-      <w:pPr>
-        <w:pStyle w:val="Heading1"/>
-      </w:pPr>
-      <w:r>
-        <w:t xml:space="preserve">4.1 Dummy Variable Analysis</w:t>
-      </w:r>
-    </w:p>
-    <w:p>
-      <w:pPr>
-        <w:pStyle w:val="FirstParagraph"/>
-      </w:pPr>
-      <w:r>
-        <w:rPr>
-          <w:b/>
-          <w:bCs/>
-        </w:rPr>
-        <w:t xml:space="preserve">A)</w:t>
-      </w:r>
-      <w:r>
-        <w:t xml:space="preserve"> </w:t>
-      </w:r>
-      <w:r>
-        <w:t xml:space="preserve">We saw that income had a negative effect on mortality. Now we want to find out if there is a threshold where it changes? Therefore, we made a dummy variable where we set the mean as the threshold for effect the dummy variable. The mean where 13249.2, and it was set to be higher than mean income. We have seen that if the income is higher.</w:t>
-      </w:r>
-    </w:p>
-    <w:p>
-      <w:pPr>
-        <w:pStyle w:val="BodyText"/>
-      </w:pPr>
-      <w:r>
-        <w:drawing>
-          <wp:inline>
-            <wp:extent cx="5334000" cy="2969867"/>
-            <wp:effectExtent b="0" l="0" r="0" t="0"/>
-            <wp:docPr descr="" title="" id="79" name="Picture"/>
-            <a:graphic>
-              <a:graphicData uri="http://schemas.openxmlformats.org/drawingml/2006/picture">
-                <pic:pic>
-                  <pic:nvPicPr>
-                    <pic:cNvPr descr="images/Bilde8.png" id="80" name="Picture"/>
-                    <pic:cNvPicPr>
-                      <a:picLocks noChangeArrowheads="1" noChangeAspect="1"/>
-                    </pic:cNvPicPr>
-                  </pic:nvPicPr>
-                  <pic:blipFill>
-                    <a:blip r:embed="rId78"/>
+                    <a:blip r:embed="rId48"/>
                     <a:stretch>
                       <a:fillRect/>
                     </a:stretch>
@@ -1582,18 +1548,18 @@
           <wp:inline>
             <wp:extent cx="5334000" cy="2969867"/>
             <wp:effectExtent b="0" l="0" r="0" t="0"/>
-            <wp:docPr descr="" title="" id="82" name="Picture"/>
+            <wp:docPr descr="" title="" id="52" name="Picture"/>
             <a:graphic>
               <a:graphicData uri="http://schemas.openxmlformats.org/drawingml/2006/picture">
                 <pic:pic>
                   <pic:nvPicPr>
-                    <pic:cNvPr descr="images/Bilde9.png" id="83" name="Picture"/>
+                    <pic:cNvPr descr="images/Bilde9.png" id="53" name="Picture"/>
                     <pic:cNvPicPr>
                       <a:picLocks noChangeArrowheads="1" noChangeAspect="1"/>
                     </pic:cNvPicPr>
                   </pic:nvPicPr>
                   <pic:blipFill>
-                    <a:blip r:embed="rId81"/>
+                    <a:blip r:embed="rId51"/>
                     <a:stretch>
                       <a:fillRect/>
                     </a:stretch>
@@ -1637,18 +1603,18 @@
           <wp:inline>
             <wp:extent cx="4305300" cy="2396546"/>
             <wp:effectExtent b="0" l="0" r="0" t="0"/>
-            <wp:docPr descr="" title="" id="85" name="Picture"/>
+            <wp:docPr descr="" title="" id="55" name="Picture"/>
             <a:graphic>
               <a:graphicData uri="http://schemas.openxmlformats.org/drawingml/2006/picture">
                 <pic:pic>
                   <pic:nvPicPr>
-                    <pic:cNvPr descr="images/Bilde10.png" id="86" name="Picture"/>
+                    <pic:cNvPr descr="images/Bilde10.png" id="56" name="Picture"/>
                     <pic:cNvPicPr>
                       <a:picLocks noChangeArrowheads="1" noChangeAspect="1"/>
                     </pic:cNvPicPr>
                   </pic:nvPicPr>
                   <pic:blipFill>
-                    <a:blip r:embed="rId84"/>
+                    <a:blip r:embed="rId54"/>
                     <a:stretch>
                       <a:fillRect/>
                     </a:stretch>
@@ -1726,18 +1692,18 @@
           <wp:inline>
             <wp:extent cx="2705100" cy="1327199"/>
             <wp:effectExtent b="0" l="0" r="0" t="0"/>
-            <wp:docPr descr="" title="" id="88" name="Picture"/>
+            <wp:docPr descr="" title="" id="58" name="Picture"/>
             <a:graphic>
               <a:graphicData uri="http://schemas.openxmlformats.org/drawingml/2006/picture">
                 <pic:pic>
                   <pic:nvPicPr>
-                    <pic:cNvPr descr="images/Bilde11.png" id="89" name="Picture"/>
+                    <pic:cNvPr descr="images/Bilde11.png" id="59" name="Picture"/>
                     <pic:cNvPicPr>
                       <a:picLocks noChangeArrowheads="1" noChangeAspect="1"/>
                     </pic:cNvPicPr>
                   </pic:nvPicPr>
                   <pic:blipFill>
-                    <a:blip r:embed="rId87"/>
+                    <a:blip r:embed="rId57"/>
                     <a:stretch>
                       <a:fillRect/>
                     </a:stretch>
@@ -1796,8 +1762,8 @@
         </w:r>
       </w:p>
     </w:p>
-    <w:bookmarkEnd w:id="90"/>
-    <w:bookmarkStart w:id="91" w:name="model-selection-and-analysis"/>
+    <w:bookmarkEnd w:id="60"/>
+    <w:bookmarkStart w:id="61" w:name="model-selection-and-analysis"/>
     <w:p>
       <w:pPr>
         <w:pStyle w:val="Heading1"/>
@@ -1898,8 +1864,8 @@
         <w:t xml:space="preserve">Overall, the multiple regression model seems to give the most reliable predictions and therefore it is the preferred model in this analysis.</w:t>
       </w:r>
     </w:p>
-    <w:bookmarkEnd w:id="91"/>
-    <w:bookmarkStart w:id="92" w:name="bibliography"/>
+    <w:bookmarkEnd w:id="61"/>
+    <w:bookmarkStart w:id="62" w:name="bibliography"/>
     <w:p>
       <w:pPr>
         <w:pStyle w:val="Heading1"/>
@@ -1974,8 +1940,12 @@
         <w:t xml:space="preserve">(1. utgave). Universitetsforlaget.</w:t>
       </w:r>
     </w:p>
-    <w:bookmarkEnd w:id="92"/>
-    <w:sectPr/>
+    <w:bookmarkEnd w:id="62"/>
+    <w:sectPr>
+      <w:footnotePr>
+        <w:numRestart w:val="eachSect"/>
+      </w:footnotePr>
+    </w:sectPr>
   </w:body>
 </w:document>
 </file>
@@ -2262,8 +2232,6 @@
     </w:pPr>
     <w:rPr>
       <w:rFonts w:asciiTheme="majorHAnsi" w:cstheme="majorBidi" w:eastAsiaTheme="majorEastAsia" w:hAnsiTheme="majorHAnsi"/>
-      <w:spacing w:val="-10"/>
-      <w:kern w:val="28"/>
       <w:sz w:val="56"/>
       <w:szCs w:val="56"/>
     </w:rPr>
@@ -2276,15 +2244,13 @@
     <w:rsid w:val="00A10FD9"/>
     <w:rPr>
       <w:rFonts w:asciiTheme="majorHAnsi" w:cstheme="majorBidi" w:eastAsiaTheme="majorEastAsia" w:hAnsiTheme="majorHAnsi"/>
-      <w:spacing w:val="-10"/>
-      <w:kern w:val="28"/>
       <w:sz w:val="56"/>
       <w:szCs w:val="56"/>
     </w:rPr>
   </w:style>
   <w:style w:styleId="Subtitle" w:type="paragraph">
     <w:name w:val="Subtitle"/>
-    <w:basedOn w:val="Normal"/>
+    <w:basedOn w:val="Title"/>
     <w:next w:val="BodyText"/>
     <w:link w:val="SubtitleChar"/>
     <w:uiPriority w:val="11"/>
@@ -2297,7 +2263,6 @@
     </w:pPr>
     <w:rPr>
       <w:rFonts w:cstheme="majorBidi" w:eastAsiaTheme="majorEastAsia"/>
-      <w:color w:themeColor="text1" w:themeTint="A6" w:val="595959"/>
       <w:spacing w:val="15"/>
       <w:sz w:val="28"/>
       <w:szCs w:val="28"/>
@@ -2319,23 +2284,31 @@
   </w:style>
   <w:style w:customStyle="1" w:styleId="Author" w:type="paragraph">
     <w:name w:val="Author"/>
+    <w:basedOn w:val="Title"/>
     <w:next w:val="BodyText"/>
     <w:qFormat/>
     <w:pPr>
       <w:keepNext/>
       <w:keepLines/>
-      <w:jc w:val="center"/>
     </w:pPr>
+    <w:rPr>
+      <w:sz w:val="24"/>
+      <w:szCs w:val="24"/>
+    </w:rPr>
   </w:style>
   <w:style w:styleId="Date" w:type="paragraph">
     <w:name w:val="Date"/>
+    <w:basedOn w:val="Title"/>
     <w:next w:val="BodyText"/>
     <w:qFormat/>
     <w:pPr>
       <w:keepNext/>
       <w:keepLines/>
-      <w:jc w:val="center"/>
     </w:pPr>
+    <w:rPr>
+      <w:sz w:val="24"/>
+      <w:szCs w:val="24"/>
+    </w:rPr>
   </w:style>
   <w:style w:customStyle="1" w:styleId="AbstractTitle" w:type="paragraph">
     <w:name w:val="Abstract Title"/>
@@ -2350,7 +2323,6 @@
     </w:pPr>
     <w:rPr>
       <w:b/>
-      <w:color w:val="345A8A"/>
       <w:sz w:val="20"/>
       <w:szCs w:val="20"/>
     </w:rPr>

</xml_diff>